<commit_message>
spike: parsing findings on real regulation, part 1 (T072)
- legal-database noise lives in DOCX headers/footers and 1x4 tables,
  not in body paragraphs; tables must not be inlined as text
- PDF: build lines from text rects by y; paragraph start by first-line
  indent; header/footer by page bands; dashes, not hyphenation
- numbering: dotted subpoints, multi-paragraph headings, approval block,
  numbering context resets
- synthetic legal-database fixture now mirrors the real layout
- reg261.docx fixture with source and sha256

Co-Authored-By: Claude Opus 5.5 <noreply@anthropic.com>
</commit_message>
<xml_diff>
--- a/tests/fixtures/synthetic/spps_export.docx
+++ b/tests/fixtures/synthetic/spps_export.docx
@@ -2,31 +2,94 @@
 <file path=word/document.xml><?xml version="1.0" encoding="utf-8"?>
 <w:document xmlns:wpc="http://schemas.microsoft.com/office/word/2010/wordprocessingCanvas" xmlns:mo="http://schemas.microsoft.com/office/mac/office/2008/main" xmlns:mc="http://schemas.openxmlformats.org/markup-compatibility/2006" xmlns:mv="urn:schemas-microsoft-com:mac:vml" xmlns:o="urn:schemas-microsoft-com:office:office" xmlns:r="http://schemas.openxmlformats.org/officeDocument/2006/relationships" xmlns:m="http://schemas.openxmlformats.org/officeDocument/2006/math" xmlns:v="urn:schemas-microsoft-com:vml" xmlns:wp14="http://schemas.microsoft.com/office/word/2010/wordprocessingDrawing" xmlns:wp="http://schemas.openxmlformats.org/drawingml/2006/wordprocessingDrawing" xmlns:w10="urn:schemas-microsoft-com:office:word" xmlns:w="http://schemas.openxmlformats.org/wordprocessingml/2006/main" xmlns:w14="http://schemas.microsoft.com/office/word/2010/wordml" xmlns:wpg="http://schemas.microsoft.com/office/word/2010/wordprocessingGroup" xmlns:wpi="http://schemas.microsoft.com/office/word/2010/wordprocessingInk" xmlns:wne="http://schemas.microsoft.com/office/word/2006/wordml" xmlns:wps="http://schemas.microsoft.com/office/word/2010/wordprocessingShape" mc:Ignorable="w14 wp14">
   <w:body>
+    <w:tbl>
+      <w:tblPr>
+        <w:tblW w:type="auto" w:w="0"/>
+        <w:tblLook w:firstColumn="1" w:firstRow="1" w:lastColumn="0" w:lastRow="0" w:noHBand="0" w:noVBand="1" w:val="04A0"/>
+      </w:tblPr>
+      <w:tblGrid>
+        <w:gridCol w:w="8640"/>
+      </w:tblGrid>
+      <w:tr>
+        <w:tc>
+          <w:tcPr>
+            <w:tcW w:type="dxa" w:w="8640"/>
+          </w:tcPr>
+          <w:p/>
+        </w:tc>
+      </w:tr>
+      <w:tr>
+        <w:tc>
+          <w:tcPr>
+            <w:tcW w:type="dxa" w:w="8640"/>
+          </w:tcPr>
+          <w:p>
+            <w:r>
+              <w:t>Приказ Управления охраны объектов Северной области от 15.01.2024 N 15</w:t>
+            </w:r>
+          </w:p>
+        </w:tc>
+      </w:tr>
+      <w:tr>
+        <w:tc>
+          <w:tcPr>
+            <w:tcW w:type="dxa" w:w="8640"/>
+          </w:tcPr>
+          <w:p>
+            <w:r>
+              <w:t>Документ предоставлен КонсультантПлюс</w:t>
+            </w:r>
+          </w:p>
+        </w:tc>
+      </w:tr>
+    </w:tbl>
     <w:p>
       <w:r>
-        <w:t>Документ предоставлен КонсультантПлюс</w:t>
+        <w:t>АДМИНИСТРАТИВНЫЙ РЕГЛАМЕНТ выдачи пропусков</w:t>
       </w:r>
     </w:p>
-    <w:p>
-      <w:r>
-        <w:t>www.consultant.ru</w:t>
-      </w:r>
-    </w:p>
-    <w:p>
-      <w:r>
-        <w:t>Дата сохранения: 01.06.2024</w:t>
-      </w:r>
-    </w:p>
-    <w:p>
-      <w:r>
-        <w:t>Список изменяющих документов</w:t>
-      </w:r>
-    </w:p>
-    <w:p>
-      <w:r>
-        <w:t>(в ред. Приказа Управления охраны объектов Северной области от 10.05.2024 N 44)</w:t>
-      </w:r>
-    </w:p>
+    <w:tbl>
+      <w:tblPr>
+        <w:tblW w:type="auto" w:w="0"/>
+        <w:tblLook w:firstColumn="1" w:firstRow="1" w:lastColumn="0" w:lastRow="0" w:noHBand="0" w:noVBand="1" w:val="04A0"/>
+      </w:tblPr>
+      <w:tblGrid>
+        <w:gridCol w:w="2160"/>
+        <w:gridCol w:w="2160"/>
+        <w:gridCol w:w="2160"/>
+        <w:gridCol w:w="2160"/>
+      </w:tblGrid>
+      <w:tr>
+        <w:tc>
+          <w:tcPr>
+            <w:tcW w:type="dxa" w:w="2160"/>
+          </w:tcPr>
+          <w:p/>
+        </w:tc>
+        <w:tc>
+          <w:tcPr>
+            <w:tcW w:type="dxa" w:w="2160"/>
+          </w:tcPr>
+          <w:p/>
+        </w:tc>
+        <w:tc>
+          <w:tcPr>
+            <w:tcW w:type="dxa" w:w="2160"/>
+          </w:tcPr>
+          <w:p>
+            <w:r>
+              <w:t>Список изменяющих документов (в ред. Приказа Управления охраны объектов Северной области от 10.05.2024 N 44)</w:t>
+            </w:r>
+          </w:p>
+        </w:tc>
+        <w:tc>
+          <w:tcPr>
+            <w:tcW w:type="dxa" w:w="2160"/>
+          </w:tcPr>
+          <w:p/>
+        </w:tc>
+      </w:tr>
+    </w:tbl>
     <w:p>
       <w:r>
         <w:t>I. Общие положения</w:t>
@@ -44,7 +107,7 @@
     </w:p>
     <w:p>
       <w:r>
-        <w:t>(п. 1.2 в ред. Приказа Управления охраны объектов Северной области от 10.05.2024 N 44)</w:t>
+        <w:t>(в ред. Приказа Управления охраны объектов Северной области от 10.05.2024 N 44)</w:t>
       </w:r>
     </w:p>
     <w:p>
@@ -52,22 +115,56 @@
         <w:t>1.3. Утратил силу. - Приказ Управления охраны объектов Северной области от 10.05.2024 N 44.</w:t>
       </w:r>
     </w:p>
+    <w:tbl>
+      <w:tblPr>
+        <w:tblW w:type="auto" w:w="0"/>
+        <w:tblLook w:firstColumn="1" w:firstRow="1" w:lastColumn="0" w:lastRow="0" w:noHBand="0" w:noVBand="1" w:val="04A0"/>
+      </w:tblPr>
+      <w:tblGrid>
+        <w:gridCol w:w="2160"/>
+        <w:gridCol w:w="2160"/>
+        <w:gridCol w:w="2160"/>
+        <w:gridCol w:w="2160"/>
+      </w:tblGrid>
+      <w:tr>
+        <w:tc>
+          <w:tcPr>
+            <w:tcW w:type="dxa" w:w="2160"/>
+          </w:tcPr>
+          <w:p/>
+        </w:tc>
+        <w:tc>
+          <w:tcPr>
+            <w:tcW w:type="dxa" w:w="2160"/>
+          </w:tcPr>
+          <w:p/>
+        </w:tc>
+        <w:tc>
+          <w:tcPr>
+            <w:tcW w:type="dxa" w:w="2160"/>
+          </w:tcPr>
+          <w:p>
+            <w:r>
+              <w:t>КонсультантПлюс: примечание. П. 1.4 применяется с учетом особенностей, установленных приказом Управления от 10.05.2024 N 44.</w:t>
+            </w:r>
+          </w:p>
+        </w:tc>
+        <w:tc>
+          <w:tcPr>
+            <w:tcW w:type="dxa" w:w="2160"/>
+          </w:tcPr>
+          <w:p/>
+        </w:tc>
+      </w:tr>
+    </w:tbl>
     <w:p>
       <w:r>
         <w:t>1.4. Пропуск выдаётся специалистом отдела пропусков.</w:t>
       </w:r>
     </w:p>
-    <w:p>
-      <w:r>
-        <w:t>Документ предоставлен КонсультантПлюс</w:t>
-      </w:r>
-    </w:p>
-    <w:p>
-      <w:r>
-        <w:t>Дата сохранения: 01.06.2024</w:t>
-      </w:r>
-    </w:p>
     <w:sectPr>
+      <w:headerReference w:type="default" r:id="rId9"/>
+      <w:footerReference w:type="default" r:id="rId10"/>
       <w:pgSz w:w="12240" w:h="15840"/>
       <w:pgMar w:top="1440" w:right="1800" w:bottom="1440" w:left="1800" w:header="720" w:footer="720" w:gutter="0"/>
       <w:cols w:space="720"/>
@@ -75,6 +172,32 @@
     </w:sectPr>
   </w:body>
 </w:document>
+</file>
+
+<file path=word/footer1.xml><?xml version="1.0" encoding="utf-8"?>
+<w:ftr xmlns:m="http://schemas.openxmlformats.org/officeDocument/2006/math" xmlns:mc="http://schemas.openxmlformats.org/markup-compatibility/2006" xmlns:mo="http://schemas.microsoft.com/office/mac/office/2008/main" xmlns:mv="urn:schemas-microsoft-com:mac:vml" xmlns:o="urn:schemas-microsoft-com:office:office" xmlns:r="http://schemas.openxmlformats.org/officeDocument/2006/relationships" xmlns:v="urn:schemas-microsoft-com:vml" xmlns:w10="urn:schemas-microsoft-com:office:word" xmlns:w14="http://schemas.microsoft.com/office/word/2010/wordml" xmlns:w="http://schemas.openxmlformats.org/wordprocessingml/2006/main" xmlns:wne="http://schemas.microsoft.com/office/word/2006/wordml" xmlns:wp14="http://schemas.microsoft.com/office/word/2010/wordprocessingDrawing" xmlns:wp="http://schemas.openxmlformats.org/drawingml/2006/wordprocessingDrawing" xmlns:wpc="http://schemas.microsoft.com/office/word/2010/wordprocessingCanvas" xmlns:wpg="http://schemas.microsoft.com/office/word/2010/wordprocessingGroup" xmlns:wpi="http://schemas.microsoft.com/office/word/2010/wordprocessingInk" xmlns:wps="http://schemas.microsoft.com/office/word/2010/wordprocessingShape" mc:Ignorable="w14 wp14">
+  <w:p>
+    <w:pPr>
+      <w:pStyle w:val="Footer"/>
+    </w:pPr>
+    <w:r>
+      <w:t>КонсультантПлюс надежная правовая поддержка www.consultant.ru Страница 1 из 1</w:t>
+    </w:r>
+  </w:p>
+</w:ftr>
+</file>
+
+<file path=word/header1.xml><?xml version="1.0" encoding="utf-8"?>
+<w:hdr xmlns:m="http://schemas.openxmlformats.org/officeDocument/2006/math" xmlns:mc="http://schemas.openxmlformats.org/markup-compatibility/2006" xmlns:mo="http://schemas.microsoft.com/office/mac/office/2008/main" xmlns:mv="urn:schemas-microsoft-com:mac:vml" xmlns:o="urn:schemas-microsoft-com:office:office" xmlns:r="http://schemas.openxmlformats.org/officeDocument/2006/relationships" xmlns:v="urn:schemas-microsoft-com:vml" xmlns:w10="urn:schemas-microsoft-com:office:word" xmlns:w14="http://schemas.microsoft.com/office/word/2010/wordml" xmlns:w="http://schemas.openxmlformats.org/wordprocessingml/2006/main" xmlns:wne="http://schemas.microsoft.com/office/word/2006/wordml" xmlns:wp14="http://schemas.microsoft.com/office/word/2010/wordprocessingDrawing" xmlns:wp="http://schemas.openxmlformats.org/drawingml/2006/wordprocessingDrawing" xmlns:wpc="http://schemas.microsoft.com/office/word/2010/wordprocessingCanvas" xmlns:wpg="http://schemas.microsoft.com/office/word/2010/wordprocessingGroup" xmlns:wpi="http://schemas.microsoft.com/office/word/2010/wordprocessingInk" xmlns:wps="http://schemas.microsoft.com/office/word/2010/wordprocessingShape" mc:Ignorable="w14 wp14">
+  <w:p>
+    <w:pPr>
+      <w:pStyle w:val="Header"/>
+    </w:pPr>
+    <w:r>
+      <w:t>Приказ Управления охраны объектов Северной области от 15.01.2024 N 15 (ред. от 10.05.2024) Документ предоставлен КонсультантПлюс Дата сохранения: 01.06.2024</w:t>
+    </w:r>
+  </w:p>
+</w:hdr>
 </file>
 
 <file path=word/numbering.xml><?xml version="1.0" encoding="utf-8"?>

</xml_diff>